<commit_message>
docs: consistency fixes across guide, assessment and project kit
Co-Authored-By: Claude Opus 5.5 <noreply@anthropic.com>
</commit_message>
<xml_diff>
--- a/guia-de-asignatura/guia-de-asignatura.docx
+++ b/guia-de-asignatura/guia-de-asignatura.docx
@@ -1208,28 +1208,6 @@
                 <w:szCs w:val="24"/>
                 <w:lang w:val="es-CO"/>
               </w:rPr>
-              <w:t xml:space="preserve">[POR COMPLETAR]</w:t>
-            </w:r>
-          </w:p>
-          <w:p>
-            <w:pPr>
-              <w:widowControl/>
-              <w:autoSpaceDE/>
-              <w:autoSpaceDN/>
-              <w:contextualSpacing/>
-              <w:rPr>
-                <w:rFonts w:asciiTheme="minorHAnsi" w:hAnsiTheme="minorHAnsi" w:cstheme="minorHAnsi"/>
-                <w:sz w:val="24"/>
-                <w:szCs w:val="24"/>
-              </w:rPr>
-            </w:pPr>
-            <w:r>
-              <w:rPr>
-                <w:rFonts w:asciiTheme="minorHAnsi" w:hAnsiTheme="minorHAnsi" w:cstheme="minorHAnsi"/>
-                <w:sz w:val="24"/>
-                <w:szCs w:val="24"/>
-                <w:lang w:val="es-CO"/>
-              </w:rPr>
               <w:t xml:space="preserve">Portal del curso: </w:t>
             </w:r>
             <w:hyperlink r:id="rIdL1" w:history="1">
@@ -1423,69 +1401,6 @@
           <w:lang w:val="es-CO"/>
         </w:rPr>
       </w:pPr>
-      <w:r>
-        <w:rPr>
-          <w:rFonts w:asciiTheme="minorHAnsi" w:hAnsiTheme="minorHAnsi" w:cstheme="minorHAnsi"/>
-          <w:noProof/>
-          <w:sz w:val="24"/>
-          <w:szCs w:val="24"/>
-        </w:rPr>
-        <w:drawing>
-          <wp:anchor distT="0" distB="0" distL="114300" distR="114300" simplePos="0" relativeHeight="251665408" behindDoc="0" locked="0" layoutInCell="1" allowOverlap="1" wp14:anchorId="27278DAF" wp14:editId="17592BE4">
-            <wp:simplePos x="0" y="0"/>
-            <wp:positionH relativeFrom="margin">
-              <wp:posOffset>3267075</wp:posOffset>
-            </wp:positionH>
-            <wp:positionV relativeFrom="paragraph">
-              <wp:posOffset>22860</wp:posOffset>
-            </wp:positionV>
-            <wp:extent cx="2496820" cy="1666875"/>
-            <wp:effectExtent l="0" t="0" r="0" b="9525"/>
-            <wp:wrapSquare wrapText="bothSides"/>
-            <wp:docPr id="4" name="Imagen 4" descr="Imagen decorativa: brújula"/>
-            <wp:cNvGraphicFramePr>
-              <a:graphicFrameLocks xmlns:a="http://schemas.openxmlformats.org/drawingml/2006/main" noChangeAspect="1"/>
-            </wp:cNvGraphicFramePr>
-            <a:graphic xmlns:a="http://schemas.openxmlformats.org/drawingml/2006/main">
-              <a:graphicData uri="http://schemas.openxmlformats.org/drawingml/2006/picture">
-                <pic:pic xmlns:pic="http://schemas.openxmlformats.org/drawingml/2006/picture">
-                  <pic:nvPicPr>
-                    <pic:cNvPr id="4" name="OM1BSP0.jpg"/>
-                    <pic:cNvPicPr/>
-                  </pic:nvPicPr>
-                  <pic:blipFill>
-                    <a:blip r:embed="rId10" cstate="print">
-                      <a:extLst>
-                        <a:ext uri="{28A0092B-C50C-407E-A947-70E740481C1C}">
-                          <a14:useLocalDpi xmlns:a14="http://schemas.microsoft.com/office/drawing/2010/main" val="0"/>
-                        </a:ext>
-                      </a:extLst>
-                    </a:blip>
-                    <a:stretch>
-                      <a:fillRect/>
-                    </a:stretch>
-                  </pic:blipFill>
-                  <pic:spPr>
-                    <a:xfrm>
-                      <a:off x="0" y="0"/>
-                      <a:ext cx="2496820" cy="1666875"/>
-                    </a:xfrm>
-                    <a:prstGeom prst="rect">
-                      <a:avLst/>
-                    </a:prstGeom>
-                  </pic:spPr>
-                </pic:pic>
-              </a:graphicData>
-            </a:graphic>
-            <wp14:sizeRelH relativeFrom="margin">
-              <wp14:pctWidth>0</wp14:pctWidth>
-            </wp14:sizeRelH>
-            <wp14:sizeRelV relativeFrom="margin">
-              <wp14:pctHeight>0</wp14:pctHeight>
-            </wp14:sizeRelV>
-          </wp:anchor>
-        </w:drawing>
-      </w:r>
       <w:r>
         <w:rPr>
           <w:rFonts w:asciiTheme="minorHAnsi" w:hAnsiTheme="minorHAnsi" w:cstheme="minorHAnsi"/>
@@ -4628,7 +4543,7 @@
           <w:szCs w:val="24"/>
           <w:lang w:val="es-CO"/>
         </w:rPr>
-        <w:t xml:space="preserve">Los hitos formativos son obligatorios y reciben retroalimentación: conformación de grupos (S3), propuesta en formato canvas (entre S5 y S6), canvas de caso de uso (S9), iteración de mejora (S11) y entrega y socialización (S12: 8 minutos de pitch, 3 de demo y 4 de preguntas por grupo; se acepta una demo pregrabada como respaldo).</w:t>
+        <w:t xml:space="preserve">Los hitos formativos son obligatorios y reciben retroalimentación: conformación de grupos (S3), propuesta en formato canvas (entre S5 y S6, con retroalimentación escrita en S6), canvas de caso de uso (S9), iteración de mejora (S11) y entrega y socialización (S12: 8 minutos de pitch, 3 de demo y 4 de preguntas por grupo; se acepta una demo pregrabada como respaldo). Los hitos no tienen nota propia, pero cada hito (H1–H4) que no se entregue en su plazo descuenta 0.3 de la nota del entregable técnico (máximo −1.2).</w:t>
       </w:r>
     </w:p>
     <w:p>
@@ -5401,7 +5316,7 @@
                 <w:szCs w:val="20"/>
                 <w:lang w:val="es-CO"/>
               </w:rPr>
-              <w:t xml:space="preserve">No calificada (obligatoria)</w:t>
+              <w:t xml:space="preserve">No calificada (obligatoria; −0.3 en el entregable técnico por hito no entregado, máximo −1.2)</w:t>
             </w:r>
           </w:p>
         </w:tc>
@@ -8183,6 +8098,27 @@
                 <w:szCs w:val="18"/>
                 <w:lang w:val="es-CO"/>
               </w:rPr>
+              <w:t xml:space="preserve">Activar la licencia de Startti antes de S6.</w:t>
+            </w:r>
+          </w:p>
+          <w:p>
+            <w:pPr>
+              <w:spacing w:before="40" w:after="40"/>
+              <w:jc w:val="left"/>
+              <w:rPr>
+                <w:rFonts w:asciiTheme="minorHAnsi" w:hAnsiTheme="minorHAnsi" w:cstheme="minorHAnsi"/>
+                <w:sz w:val="18"/>
+                <w:szCs w:val="18"/>
+                <w:lang w:val="es-CO"/>
+              </w:rPr>
+            </w:pPr>
+            <w:r>
+              <w:rPr>
+                <w:rFonts w:asciiTheme="minorHAnsi" w:hAnsiTheme="minorHAnsi" w:cstheme="minorHAnsi"/>
+                <w:sz w:val="18"/>
+                <w:szCs w:val="18"/>
+                <w:lang w:val="es-CO"/>
+              </w:rPr>
               <w:t xml:space="preserve">Lectura: Jurafsky y Martin (2023), apartados de evaluación; Google (2023), métricas de clasificación.</w:t>
             </w:r>
           </w:p>
@@ -8575,7 +8511,7 @@
                 <w:szCs w:val="18"/>
                 <w:lang w:val="es-CO"/>
               </w:rPr>
-              <w:t xml:space="preserve">Activar la licencia de Startti y guardar la clave de API en Kaggle Secrets antes de S7.</w:t>
+              <w:t xml:space="preserve">Guardar la clave de API de Startti en Kaggle Secrets, lista para S7.</w:t>
             </w:r>
           </w:p>
           <w:p>
@@ -11520,7 +11456,7 @@
           <w:szCs w:val="24"/>
           <w:lang w:val="es-CO"/>
         </w:rPr>
-        <w:t xml:space="preserve"> conforma el grupo en la sesión 3, acuerden roles y un canal de comunicación, y aprovechen los hitos formativos para recibir retroalimentación.</w:t>
+        <w:t xml:space="preserve"> conforma tu grupo en la sesión 3, acuerda con tus compañeros los roles y un canal de comunicación, y aprovecha los hitos formativos para recibir retroalimentación.</w:t>
       </w:r>
     </w:p>
     <w:p>
@@ -11840,7 +11776,7 @@
           <w:szCs w:val="24"/>
           <w:lang w:val="es-CO"/>
         </w:rPr>
-        <w:t xml:space="preserve">High-Level Expert Group on Artificial Intelligence [HLEG]. (2019). </w:t>
+        <w:t xml:space="preserve">High-Level Expert Group on Artificial Intelligence. (2019). </w:t>
       </w:r>
       <w:r>
         <w:rPr>
@@ -12022,8 +11958,20 @@
           <w:szCs w:val="24"/>
           <w:lang w:val="es-CO"/>
         </w:rPr>
-        <w:t xml:space="preserve">. McKinsey Global Institute.</w:t>
-      </w:r>
+        <w:t xml:space="preserve">. McKinsey Global Institute. </w:t>
+      </w:r>
+      <w:hyperlink r:id="rIdL28" w:history="1">
+        <w:r>
+          <w:rPr>
+            <w:rStyle w:val="Hipervnculo"/>
+            <w:rFonts w:asciiTheme="minorHAnsi" w:hAnsiTheme="minorHAnsi" w:cstheme="minorHAnsi"/>
+            <w:sz w:val="24"/>
+            <w:szCs w:val="24"/>
+            <w:lang w:val="es-CO"/>
+          </w:rPr>
+          <w:t xml:space="preserve">https://www.mckinsey.com/capabilities/tech-and-ai/our-insights/the-economic-potential-of-generative-ai-the-next-productivity-frontier</w:t>
+        </w:r>
+      </w:hyperlink>
     </w:p>
     <w:p>
       <w:pPr>
@@ -12417,7 +12365,7 @@
           <w:szCs w:val="24"/>
           <w:lang w:val="es-CO"/>
         </w:rPr>
-        <w:t xml:space="preserve">Consejo Nacional de Política Económica y Social [CONPES] y Departamento Nacional de Planeación [DNP]. (2025). </w:t>
+        <w:t xml:space="preserve">Consejo Nacional de Política Económica y Social y Departamento Nacional de Planeación. (2025). </w:t>
       </w:r>
       <w:r>
         <w:rPr>
@@ -12791,8 +12739,20 @@
           <w:szCs w:val="24"/>
           <w:lang w:val="es-CO"/>
         </w:rPr>
-        <w:t xml:space="preserve">. ACM.</w:t>
-      </w:r>
+        <w:t xml:space="preserve">. ACM. </w:t>
+      </w:r>
+      <w:hyperlink r:id="rIdL27" w:history="1">
+        <w:r>
+          <w:rPr>
+            <w:rStyle w:val="Hipervnculo"/>
+            <w:rFonts w:asciiTheme="minorHAnsi" w:hAnsiTheme="minorHAnsi" w:cstheme="minorHAnsi"/>
+            <w:sz w:val="24"/>
+            <w:szCs w:val="24"/>
+            <w:lang w:val="es-CO"/>
+          </w:rPr>
+          <w:t xml:space="preserve">https://doi.org/10.1145/3630106.3658542</w:t>
+        </w:r>
+      </w:hyperlink>
     </w:p>
     <w:p>
       <w:pPr>
@@ -12867,7 +12827,7 @@
           <w:szCs w:val="24"/>
           <w:lang w:val="es-CO"/>
         </w:rPr>
-        <w:t xml:space="preserve">National Institute of Standards and Technology [NIST]. (2023). </w:t>
+        <w:t xml:space="preserve">National Institute of Standards and Technology. (2023). </w:t>
       </w:r>
       <w:r>
         <w:rPr>

</xml_diff>

<commit_message>
docs: align course materials with October 2026 session calendar
Update the course guide (docx + md) with the course code, group, professor
profile, institutional email, office hours and the 12-session calendar
(2-24 Oct 2026, Fri 18-21 / Sat 7-13), and remove the transparency note.
Organize everything by sessions instead of weeks, move the H2 proposal to
Wed 14 Oct with feedback in S07, and deliver H4 inside the final report on
Fri 23 Oct. Align docs, portal, project kit and session materials.

Co-Authored-By: Claude Opus 5.5 <noreply@anthropic.com>
</commit_message>
<xml_diff>
--- a/guia-de-asignatura/guia-de-asignatura.docx
+++ b/guia-de-asignatura/guia-de-asignatura.docx
@@ -191,7 +191,7 @@
                 <w:szCs w:val="24"/>
                 <w:lang w:val="es-CO"/>
               </w:rPr>
-              <w:t xml:space="preserve">Desarrollo y Evaluación de Modelos Propios</w:t>
+              <w:t xml:space="preserve">Desarrollo y Evaluación de Modelos Propios – Gr. 1</w:t>
             </w:r>
           </w:p>
         </w:tc>
@@ -347,7 +347,7 @@
                 <w:szCs w:val="24"/>
                 <w:lang w:val="es-CO"/>
               </w:rPr>
-              <w:t xml:space="preserve">[POR COMPLETAR]</w:t>
+              <w:t xml:space="preserve">75220005</w:t>
             </w:r>
           </w:p>
         </w:tc>
@@ -558,7 +558,7 @@
                 <w:szCs w:val="24"/>
                 <w:lang w:val="es-CO"/>
               </w:rPr>
-              <w:t xml:space="preserve">3 horas semanales: 12 sesiones sincrónicas de 3 horas (36 horas en el periodo académico).</w:t>
+              <w:t xml:space="preserve">36 horas: 12 sesiones sincrónicas de 3 horas, en 8 encuentros (4 viernes con una sesión de 3 horas y 4 sábados con dos sesiones consecutivas de 3 horas).</w:t>
             </w:r>
           </w:p>
         </w:tc>
@@ -625,7 +625,7 @@
                 <w:szCs w:val="24"/>
                 <w:lang w:val="es-CO"/>
               </w:rPr>
-              <w:t xml:space="preserve">9 horas semanales (108 horas en el periodo académico). Total del curso: 144 horas.</w:t>
+              <w:t xml:space="preserve">9 horas por sesión (108 horas en el periodo académico). Total del curso: 144 horas.</w:t>
             </w:r>
           </w:p>
         </w:tc>
@@ -783,7 +783,7 @@
                 <w:szCs w:val="24"/>
                 <w:lang w:val="es-CO"/>
               </w:rPr>
-              <w:t xml:space="preserve">[POR COMPLETAR]</w:t>
+              <w:t xml:space="preserve">Del 2 al 24 de octubre de 2026 (hora de Colombia): viernes 2, 9, 16 y 23 de octubre, de 18:00 a 21:00 (una sesión); sábados 3, 10, 17 y 24 de octubre, de 7:00 a 13:00 (dos sesiones consecutivas: 7:00–10:00 y 10:00–13:00).</w:t>
             </w:r>
           </w:p>
         </w:tc>
@@ -972,7 +972,7 @@
                 <w:szCs w:val="24"/>
                 <w:lang w:val="es-CO"/>
               </w:rPr>
-              <w:t xml:space="preserve">Julian Caicedo</w:t>
+              <w:t xml:space="preserve">Julian Camilo Caicedo Acosta</w:t>
             </w:r>
           </w:p>
         </w:tc>
@@ -1042,7 +1042,7 @@
                 <w:szCs w:val="24"/>
                 <w:lang w:val="es-CO"/>
               </w:rPr>
-              <w:t xml:space="preserve">[POR COMPLETAR: perfil profesional del profesor]</w:t>
+              <w:t xml:space="preserve">Ingeniero electrónico, magíster en Ingeniería con énfasis en automatización industrial y doctor en Ingeniería con énfasis en automatización basada en inteligencia artificial (tesis laureada) de la Universidad Nacional de Colombia, sede Manizales. Tiene más de 7 años de experiencia en el desarrollo de soluciones de ciencia de datos y aprendizaje automático en la empresa y la academia, con énfasis en IA generativa, visión por computador y despliegue en la nube (AWS, GCP y Azure). Es CEO y cofundador de Startti AI, empresa dedicada a la creación y orquestación de agentes de IA autónomos para la automatización de procesos de negocio. Ha dirigido las áreas de ciencia y analítica de datos de ALTIPAL, Sumatec y BIOS (Centro de Bioinformática y Biología Computacional de Colombia), y lideró el desarrollo de una plataforma de medición del espectro electromagnético con la Universidad Nacional de Colombia y la Agencia Nacional del Espectro. Fue profesor e investigador en IA y automatización en la Universidad Autónoma de Manizales (2020–2023) y es autor de publicaciones científicas sobre aprendizaje automático aplicado a señales EEG, neurociencia y visión por computador.</w:t>
             </w:r>
           </w:p>
         </w:tc>
@@ -1097,7 +1097,7 @@
                 <w:szCs w:val="24"/>
                 <w:lang w:val="es-CO"/>
               </w:rPr>
-              <w:t xml:space="preserve">[POR COMPLETAR]</w:t>
+              <w:t xml:space="preserve">julian.caicedo@urosario.edu.co</w:t>
             </w:r>
           </w:p>
         </w:tc>
@@ -1151,7 +1151,7 @@
                 <w:szCs w:val="24"/>
                 <w:lang w:val="es-CO"/>
               </w:rPr>
-              <w:t xml:space="preserve">[POR COMPLETAR]</w:t>
+              <w:t xml:space="preserve">Virtual (videoconferencia), con cita previa solicitada al correo institucional. Respuesta en máximo 2 días hábiles.</w:t>
             </w:r>
           </w:p>
         </w:tc>
@@ -1259,61 +1259,6 @@
           </w:p>
         </w:tc>
       </w:tr>
-      <w:tr>
-        <w:tc>
-          <w:tcPr>
-            <w:tcW w:w="2845" w:type="dxa"/>
-          </w:tcPr>
-          <w:p>
-            <w:pPr>
-              <w:jc w:val="both"/>
-              <w:rPr>
-                <w:rFonts w:asciiTheme="minorHAnsi" w:hAnsiTheme="minorHAnsi" w:cstheme="minorHAnsi"/>
-                <w:b/>
-                <w:bCs/>
-                <w:sz w:val="28"/>
-                <w:szCs w:val="28"/>
-              </w:rPr>
-            </w:pPr>
-            <w:r>
-              <w:rPr>
-                <w:rFonts w:asciiTheme="minorHAnsi" w:hAnsiTheme="minorHAnsi" w:cstheme="minorHAnsi"/>
-                <w:b/>
-                <w:sz w:val="24"/>
-                <w:szCs w:val="24"/>
-              </w:rPr>
-              <w:t xml:space="preserve">Declaración de transparencia</w:t>
-            </w:r>
-          </w:p>
-        </w:tc>
-        <w:tc>
-          <w:tcPr>
-            <w:tcW w:w="6184" w:type="dxa"/>
-          </w:tcPr>
-          <w:p>
-            <w:pPr>
-              <w:widowControl/>
-              <w:autoSpaceDE/>
-              <w:autoSpaceDN/>
-              <w:contextualSpacing/>
-              <w:rPr>
-                <w:rFonts w:asciiTheme="minorHAnsi" w:hAnsiTheme="minorHAnsi" w:cstheme="minorHAnsi"/>
-                <w:sz w:val="24"/>
-                <w:szCs w:val="24"/>
-              </w:rPr>
-            </w:pPr>
-            <w:r>
-              <w:rPr>
-                <w:rFonts w:asciiTheme="minorHAnsi" w:hAnsiTheme="minorHAnsi" w:cstheme="minorHAnsi"/>
-                <w:sz w:val="24"/>
-                <w:szCs w:val="24"/>
-                <w:lang w:val="es-CO"/>
-              </w:rPr>
-              <w:t xml:space="preserve">El profesor hace parte de Startti, la plataforma de agentes (Startti ADP) que se usa en algunas sesiones del curso; las licencias se entregan a los estudiantes sin costo y siempre hay una alternativa que no requiere crear una cuenta.</w:t>
-            </w:r>
-          </w:p>
-        </w:tc>
-      </w:tr>
     </w:tbl>
     <w:p>
       <w:pPr>
@@ -2785,7 +2730,7 @@
           <w:szCs w:val="24"/>
           <w:lang w:val="es-CO"/>
         </w:rPr>
-        <w:t xml:space="preserve"> El curso se desarrolla en su totalidad de forma remota y sincrónica: 12 sesiones semanales de 3 horas por videoconferencia, cuyo enlace se publica en e-Aulas. El aula virtual e-Aulas concentra la guía, los enlaces a los materiales, las entregas, los foros y los anuncios del curso.</w:t>
+        <w:t xml:space="preserve"> El curso se desarrolla en su totalidad de forma remota y sincrónica: 12 sesiones de 3 horas por videoconferencia, los viernes y sábados entre el 2 y el 24 de octubre de 2026, cuyo enlace se publica en e-Aulas. El aula virtual e-Aulas concentra la guía, los enlaces a los materiales, las entregas, los foros y los anuncios del curso.</w:t>
       </w:r>
     </w:p>
     <w:p>
@@ -3065,7 +3010,7 @@
           <w:szCs w:val="24"/>
           <w:lang w:val="es-CO"/>
         </w:rPr>
-        <w:t xml:space="preserve"> un proyecto grupal atraviesa el semestre, con hitos formativos en S3, S5–S6, S9 y S11, y culmina con la socialización en S12.</w:t>
+        <w:t xml:space="preserve"> un proyecto grupal atraviesa el curso, con hitos formativos entre S3 y S10 (grupos, propuesta, canvas de caso de uso e iteración de mejora), y culmina con la socialización en S12.</w:t>
       </w:r>
     </w:p>
     <w:p>
@@ -3213,7 +3158,7 @@
           <w:szCs w:val="24"/>
           <w:lang w:val="es-CO"/>
         </w:rPr>
-        <w:t xml:space="preserve"> cada sesión cierra con un challenge individual y retroalimentación, de modo que el estudiante conoce su progreso semana a semana.</w:t>
+        <w:t xml:space="preserve"> cada sesión cierra con un challenge individual y retroalimentación, de modo que el estudiante conoce su progreso sesión a sesión.</w:t>
       </w:r>
     </w:p>
     <w:p>
@@ -4321,7 +4266,7 @@
           <w:szCs w:val="24"/>
           <w:lang w:val="es-CO"/>
         </w:rPr>
-        <w:t xml:space="preserve"> en cada sesión, 3 o 4 estudiantes elegidos al azar explican en vivo una celda de su notebook (2–3 minutos, con cámara y pantalla compartida); cada estudiante pasa al menos dos veces en el semestre. Si el estudiante no puede explicar su propia entrega, la nota de ese challenge se limita a 3.0.</w:t>
+        <w:t xml:space="preserve"> en cada sesión, 3 o 4 estudiantes elegidos al azar explican en vivo una celda de su notebook (2–3 minutos, con cámara y pantalla compartida); cada estudiante pasa al menos dos veces durante el curso. Si el estudiante no puede explicar su propia entrega, la nota de ese challenge se limita a 3.0.</w:t>
       </w:r>
     </w:p>
     <w:p>
@@ -4543,7 +4488,7 @@
           <w:szCs w:val="24"/>
           <w:lang w:val="es-CO"/>
         </w:rPr>
-        <w:t xml:space="preserve">Los hitos formativos son obligatorios y reciben retroalimentación: conformación de grupos (S3), propuesta en formato canvas (entre S5 y S6, con retroalimentación escrita en S6), canvas de caso de uso (S9), iteración de mejora (S11) y entrega y socialización (S12: 8 minutos de pitch, 3 de demo y 4 de preguntas por grupo; se acepta una demo pregrabada como respaldo). Los hitos no tienen nota propia, pero cada hito (H1–H4) que no se entregue en su plazo descuenta 0.3 de la nota del entregable técnico (máximo −1.2).</w:t>
+        <w:t xml:space="preserve">Los hitos formativos son obligatorios y reciben retroalimentación: conformación de grupos (S3), propuesta en formato canvas (entrega hasta el miércoles 14 de octubre a las 23:59, con retroalimentación escrita en S7), canvas de caso de uso (S9), iteración de mejora (documentada en el informe técnico y entregada con la entrega final, el viernes 23 de octubre a las 23:59) y socialización (S12: 8 minutos de pitch, 3 de demo y 4 de preguntas por grupo; se acepta una demo pregrabada como respaldo). Los hitos no tienen nota propia, pero cada hito (H1–H4) que no se entregue en su plazo descuenta 0.3 de la nota del entregable técnico (máximo −1.2).</w:t>
       </w:r>
     </w:p>
     <w:p>
@@ -4731,7 +4676,7 @@
           <w:szCs w:val="24"/>
           <w:lang w:val="es-CO"/>
         </w:rPr>
-        <w:t xml:space="preserve">La siguiente tabla resume las actividades según su propósito (diagnóstico, formativo o sumativo), el momento del semestre, los RAE asociados y su peso en la nota final.</w:t>
+        <w:t xml:space="preserve">La siguiente tabla resume las actividades según su propósito (diagnóstico, formativo o sumativo), el momento del curso, los RAE asociados y su peso en la nota final.</w:t>
       </w:r>
     </w:p>
     <w:tbl>
@@ -5237,7 +5182,7 @@
                 <w:szCs w:val="20"/>
                 <w:lang w:val="es-CO"/>
               </w:rPr>
-              <w:t xml:space="preserve">Sesiones 3–11 (diálogo formativo: semanas 4 a 6)</w:t>
+              <w:t xml:space="preserve">Sesiones 3–10 (diálogo formativo: sesiones 4 a 7)</w:t>
             </w:r>
           </w:p>
         </w:tc>
@@ -5263,7 +5208,7 @@
                 <w:szCs w:val="20"/>
                 <w:lang w:val="es-CO"/>
               </w:rPr>
-              <w:t xml:space="preserve">Hitos del proyecto con retroalimentación: grupos (S3), propuesta (S5–S6), canvas de caso de uso (S9) e iteración de mejora (S11).</w:t>
+              <w:t xml:space="preserve">Hitos del proyecto con retroalimentación: grupos (S3), propuesta (después de S6, con retroalimentación en S7), canvas de caso de uso (S9) e iteración de mejora (con la entrega final, antes de S11).</w:t>
             </w:r>
           </w:p>
         </w:tc>
@@ -5711,7 +5656,7 @@
           <w:szCs w:val="24"/>
           <w:lang w:val="es-CO"/>
         </w:rPr>
-        <w:t xml:space="preserve">La programación organiza las 12 sesiones semanales del curso. Cada sesión sincrónica dura 3 horas (calentamiento 10 min, teoría 60 min, descanso 10 min, práctica guiada 60 min y challenge 40 min). Las 9 horas semanales de trabajo independiente se distribuyen así: preparación previa (≈2 h), cierre y entrega del challenge (≈2 h), práctica autónoma (≈2 h) y proyecto final (≈3 h).</w:t>
+        <w:t xml:space="preserve">La programación organiza las 12 sesiones del curso, entre el 2 y el 24 de octubre de 2026: los viernes de 18:00 a 21:00 hay una sesión y los sábados de 7:00 a 13:00 hay dos sesiones consecutivas (7:00–10:00 y 10:00–13:00). Cada sesión sincrónica dura 3 horas (calentamiento 10 min, teoría 60 min, descanso 10 min, práctica guiada 60 min y challenge 40 min). A cada sesión le corresponden cerca de 9 horas de trabajo independiente: preparación previa (≈2 h), cierre y entrega del challenge (≈2 h), práctica autónoma (≈2 h) y proyecto final (≈3 h). Como las sesiones del sábado son consecutivas, la preparación de S2–S3, S5–S6, S8–S9 y S11–S12 se hace antes del viernes correspondiente.</w:t>
       </w:r>
     </w:p>
     <w:p>
@@ -6083,7 +6028,28 @@
                 <w:szCs w:val="18"/>
                 <w:lang w:val="es-CO"/>
               </w:rPr>
-              <w:t xml:space="preserve">Semana 1</w:t>
+              <w:t xml:space="preserve">Viernes 2 oct.</w:t>
+            </w:r>
+          </w:p>
+          <w:p>
+            <w:pPr>
+              <w:spacing w:before="40" w:after="40"/>
+              <w:jc w:val="center"/>
+              <w:rPr>
+                <w:rFonts w:asciiTheme="minorHAnsi" w:hAnsiTheme="minorHAnsi" w:cstheme="minorHAnsi"/>
+                <w:sz w:val="18"/>
+                <w:szCs w:val="18"/>
+                <w:lang w:val="es-CO"/>
+              </w:rPr>
+            </w:pPr>
+            <w:r>
+              <w:rPr>
+                <w:rFonts w:asciiTheme="minorHAnsi" w:hAnsiTheme="minorHAnsi" w:cstheme="minorHAnsi"/>
+                <w:sz w:val="18"/>
+                <w:szCs w:val="18"/>
+                <w:lang w:val="es-CO"/>
+              </w:rPr>
+              <w:t xml:space="preserve">18:00–21:00</w:t>
             </w:r>
           </w:p>
         </w:tc>
@@ -6589,7 +6555,28 @@
                 <w:szCs w:val="18"/>
                 <w:lang w:val="es-CO"/>
               </w:rPr>
-              <w:t xml:space="preserve">Semana 2</w:t>
+              <w:t xml:space="preserve">Sábado 3 oct.</w:t>
+            </w:r>
+          </w:p>
+          <w:p>
+            <w:pPr>
+              <w:spacing w:before="40" w:after="40"/>
+              <w:jc w:val="center"/>
+              <w:rPr>
+                <w:rFonts w:asciiTheme="minorHAnsi" w:hAnsiTheme="minorHAnsi" w:cstheme="minorHAnsi"/>
+                <w:sz w:val="18"/>
+                <w:szCs w:val="18"/>
+                <w:lang w:val="es-CO"/>
+              </w:rPr>
+            </w:pPr>
+            <w:r>
+              <w:rPr>
+                <w:rFonts w:asciiTheme="minorHAnsi" w:hAnsiTheme="minorHAnsi" w:cstheme="minorHAnsi"/>
+                <w:sz w:val="18"/>
+                <w:szCs w:val="18"/>
+                <w:lang w:val="es-CO"/>
+              </w:rPr>
+              <w:t xml:space="preserve">7:00–10:00</w:t>
             </w:r>
           </w:p>
         </w:tc>
@@ -6981,7 +6968,28 @@
                 <w:szCs w:val="18"/>
                 <w:lang w:val="es-CO"/>
               </w:rPr>
-              <w:t xml:space="preserve">Semana 3</w:t>
+              <w:t xml:space="preserve">Sábado 3 oct.</w:t>
+            </w:r>
+          </w:p>
+          <w:p>
+            <w:pPr>
+              <w:spacing w:before="40" w:after="40"/>
+              <w:jc w:val="center"/>
+              <w:rPr>
+                <w:rFonts w:asciiTheme="minorHAnsi" w:hAnsiTheme="minorHAnsi" w:cstheme="minorHAnsi"/>
+                <w:sz w:val="18"/>
+                <w:szCs w:val="18"/>
+                <w:lang w:val="es-CO"/>
+              </w:rPr>
+            </w:pPr>
+            <w:r>
+              <w:rPr>
+                <w:rFonts w:asciiTheme="minorHAnsi" w:hAnsiTheme="minorHAnsi" w:cstheme="minorHAnsi"/>
+                <w:sz w:val="18"/>
+                <w:szCs w:val="18"/>
+                <w:lang w:val="es-CO"/>
+              </w:rPr>
+              <w:t xml:space="preserve">10:00–13:00</w:t>
             </w:r>
           </w:p>
         </w:tc>
@@ -7394,7 +7402,28 @@
                 <w:szCs w:val="18"/>
                 <w:lang w:val="es-CO"/>
               </w:rPr>
-              <w:t xml:space="preserve">Semana 4</w:t>
+              <w:t xml:space="preserve">Viernes 9 oct.</w:t>
+            </w:r>
+          </w:p>
+          <w:p>
+            <w:pPr>
+              <w:spacing w:before="40" w:after="40"/>
+              <w:jc w:val="center"/>
+              <w:rPr>
+                <w:rFonts w:asciiTheme="minorHAnsi" w:hAnsiTheme="minorHAnsi" w:cstheme="minorHAnsi"/>
+                <w:sz w:val="18"/>
+                <w:szCs w:val="18"/>
+                <w:lang w:val="es-CO"/>
+              </w:rPr>
+            </w:pPr>
+            <w:r>
+              <w:rPr>
+                <w:rFonts w:asciiTheme="minorHAnsi" w:hAnsiTheme="minorHAnsi" w:cstheme="minorHAnsi"/>
+                <w:sz w:val="18"/>
+                <w:szCs w:val="18"/>
+                <w:lang w:val="es-CO"/>
+              </w:rPr>
+              <w:t xml:space="preserve">18:00–21:00</w:t>
             </w:r>
           </w:p>
         </w:tc>
@@ -7828,7 +7857,28 @@
                 <w:szCs w:val="18"/>
                 <w:lang w:val="es-CO"/>
               </w:rPr>
-              <w:t xml:space="preserve">Semana 5</w:t>
+              <w:t xml:space="preserve">Sábado 10 oct.</w:t>
+            </w:r>
+          </w:p>
+          <w:p>
+            <w:pPr>
+              <w:spacing w:before="40" w:after="40"/>
+              <w:jc w:val="center"/>
+              <w:rPr>
+                <w:rFonts w:asciiTheme="minorHAnsi" w:hAnsiTheme="minorHAnsi" w:cstheme="minorHAnsi"/>
+                <w:sz w:val="18"/>
+                <w:szCs w:val="18"/>
+                <w:lang w:val="es-CO"/>
+              </w:rPr>
+            </w:pPr>
+            <w:r>
+              <w:rPr>
+                <w:rFonts w:asciiTheme="minorHAnsi" w:hAnsiTheme="minorHAnsi" w:cstheme="minorHAnsi"/>
+                <w:sz w:val="18"/>
+                <w:szCs w:val="18"/>
+                <w:lang w:val="es-CO"/>
+              </w:rPr>
+              <w:t xml:space="preserve">7:00–10:00</w:t>
             </w:r>
           </w:p>
         </w:tc>
@@ -8077,7 +8127,7 @@
                 <w:szCs w:val="18"/>
                 <w:lang w:val="es-CO"/>
               </w:rPr>
-              <w:t xml:space="preserve">Proyecto: entregar la propuesta (canvas) en e-Aulas antes de S6.</w:t>
+              <w:t xml:space="preserve">Proyecto: avanzar en la propuesta (canvas).</w:t>
             </w:r>
           </w:p>
           <w:p>
@@ -8241,7 +8291,28 @@
                 <w:szCs w:val="18"/>
                 <w:lang w:val="es-CO"/>
               </w:rPr>
-              <w:t xml:space="preserve">Semana 6</w:t>
+              <w:t xml:space="preserve">Sábado 10 oct.</w:t>
+            </w:r>
+          </w:p>
+          <w:p>
+            <w:pPr>
+              <w:spacing w:before="40" w:after="40"/>
+              <w:jc w:val="center"/>
+              <w:rPr>
+                <w:rFonts w:asciiTheme="minorHAnsi" w:hAnsiTheme="minorHAnsi" w:cstheme="minorHAnsi"/>
+                <w:sz w:val="18"/>
+                <w:szCs w:val="18"/>
+                <w:lang w:val="es-CO"/>
+              </w:rPr>
+            </w:pPr>
+            <w:r>
+              <w:rPr>
+                <w:rFonts w:asciiTheme="minorHAnsi" w:hAnsiTheme="minorHAnsi" w:cstheme="minorHAnsi"/>
+                <w:sz w:val="18"/>
+                <w:szCs w:val="18"/>
+                <w:lang w:val="es-CO"/>
+              </w:rPr>
+              <w:t xml:space="preserve">10:00–13:00</w:t>
             </w:r>
           </w:p>
         </w:tc>
@@ -8464,7 +8535,7 @@
                 <w:szCs w:val="18"/>
                 <w:lang w:val="es-CO"/>
               </w:rPr>
-              <w:t xml:space="preserve">Diálogo formativo: devolución de la retroalimentación escrita de las propuestas.</w:t>
+              <w:t xml:space="preserve">Diálogo formativo: orientaciones para la propuesta del proyecto.</w:t>
             </w:r>
           </w:p>
         </w:tc>
@@ -8532,7 +8603,7 @@
                 <w:szCs w:val="18"/>
                 <w:lang w:val="es-CO"/>
               </w:rPr>
-              <w:t xml:space="preserve">Proyecto: ajustar el alcance según la retroalimentación.</w:t>
+              <w:t xml:space="preserve">Proyecto: entregar la propuesta (canvas) en e-Aulas hasta el miércoles 14 de octubre, 23:59.</w:t>
             </w:r>
           </w:p>
         </w:tc>
@@ -8675,7 +8746,28 @@
                 <w:szCs w:val="18"/>
                 <w:lang w:val="es-CO"/>
               </w:rPr>
-              <w:t xml:space="preserve">Semana 7</w:t>
+              <w:t xml:space="preserve">Viernes 16 oct.</w:t>
+            </w:r>
+          </w:p>
+          <w:p>
+            <w:pPr>
+              <w:spacing w:before="40" w:after="40"/>
+              <w:jc w:val="center"/>
+              <w:rPr>
+                <w:rFonts w:asciiTheme="minorHAnsi" w:hAnsiTheme="minorHAnsi" w:cstheme="minorHAnsi"/>
+                <w:sz w:val="18"/>
+                <w:szCs w:val="18"/>
+                <w:lang w:val="es-CO"/>
+              </w:rPr>
+            </w:pPr>
+            <w:r>
+              <w:rPr>
+                <w:rFonts w:asciiTheme="minorHAnsi" w:hAnsiTheme="minorHAnsi" w:cstheme="minorHAnsi"/>
+                <w:sz w:val="18"/>
+                <w:szCs w:val="18"/>
+                <w:lang w:val="es-CO"/>
+              </w:rPr>
+              <w:t xml:space="preserve">18:00–21:00</w:t>
             </w:r>
           </w:p>
         </w:tc>
@@ -8878,6 +8970,27 @@
                 <w:lang w:val="es-CO"/>
               </w:rPr>
               <w:t xml:space="preserve"> dominio y FAQ asignados; 12 conversaciones de prueba; métricas por tipo; una iteración de mejora; ¿está listo para producción?</w:t>
+            </w:r>
+          </w:p>
+          <w:p>
+            <w:pPr>
+              <w:spacing w:before="40" w:after="40"/>
+              <w:jc w:val="left"/>
+              <w:rPr>
+                <w:rFonts w:asciiTheme="minorHAnsi" w:hAnsiTheme="minorHAnsi" w:cstheme="minorHAnsi"/>
+                <w:sz w:val="18"/>
+                <w:szCs w:val="18"/>
+                <w:lang w:val="es-CO"/>
+              </w:rPr>
+            </w:pPr>
+            <w:r>
+              <w:rPr>
+                <w:rFonts w:asciiTheme="minorHAnsi" w:hAnsiTheme="minorHAnsi" w:cstheme="minorHAnsi"/>
+                <w:sz w:val="18"/>
+                <w:szCs w:val="18"/>
+                <w:lang w:val="es-CO"/>
+              </w:rPr>
+              <w:t xml:space="preserve">Diálogo formativo: devolución de la retroalimentación escrita de las propuestas.</w:t>
             </w:r>
           </w:p>
         </w:tc>
@@ -8987,7 +9100,7 @@
                 <w:szCs w:val="18"/>
                 <w:lang w:val="es-CO"/>
               </w:rPr>
-              <w:t xml:space="preserve">Proyecto: preparar los datos y la línea base.</w:t>
+              <w:t xml:space="preserve">Proyecto: ajustar el alcance según la retroalimentación y preparar los datos y la línea base.</w:t>
             </w:r>
           </w:p>
         </w:tc>
@@ -9130,7 +9243,28 @@
                 <w:szCs w:val="18"/>
                 <w:lang w:val="es-CO"/>
               </w:rPr>
-              <w:t xml:space="preserve">Semana 8</w:t>
+              <w:t xml:space="preserve">Sábado 17 oct.</w:t>
+            </w:r>
+          </w:p>
+          <w:p>
+            <w:pPr>
+              <w:spacing w:before="40" w:after="40"/>
+              <w:jc w:val="center"/>
+              <w:rPr>
+                <w:rFonts w:asciiTheme="minorHAnsi" w:hAnsiTheme="minorHAnsi" w:cstheme="minorHAnsi"/>
+                <w:sz w:val="18"/>
+                <w:szCs w:val="18"/>
+                <w:lang w:val="es-CO"/>
+              </w:rPr>
+            </w:pPr>
+            <w:r>
+              <w:rPr>
+                <w:rFonts w:asciiTheme="minorHAnsi" w:hAnsiTheme="minorHAnsi" w:cstheme="minorHAnsi"/>
+                <w:sz w:val="18"/>
+                <w:szCs w:val="18"/>
+                <w:lang w:val="es-CO"/>
+              </w:rPr>
+              <w:t xml:space="preserve">7:00–10:00</w:t>
             </w:r>
           </w:p>
         </w:tc>
@@ -9522,7 +9656,28 @@
                 <w:szCs w:val="18"/>
                 <w:lang w:val="es-CO"/>
               </w:rPr>
-              <w:t xml:space="preserve">Semana 9</w:t>
+              <w:t xml:space="preserve">Sábado 17 oct.</w:t>
+            </w:r>
+          </w:p>
+          <w:p>
+            <w:pPr>
+              <w:spacing w:before="40" w:after="40"/>
+              <w:jc w:val="center"/>
+              <w:rPr>
+                <w:rFonts w:asciiTheme="minorHAnsi" w:hAnsiTheme="minorHAnsi" w:cstheme="minorHAnsi"/>
+                <w:sz w:val="18"/>
+                <w:szCs w:val="18"/>
+                <w:lang w:val="es-CO"/>
+              </w:rPr>
+            </w:pPr>
+            <w:r>
+              <w:rPr>
+                <w:rFonts w:asciiTheme="minorHAnsi" w:hAnsiTheme="minorHAnsi" w:cstheme="minorHAnsi"/>
+                <w:sz w:val="18"/>
+                <w:szCs w:val="18"/>
+                <w:lang w:val="es-CO"/>
+              </w:rPr>
+              <w:t xml:space="preserve">10:00–13:00</w:t>
             </w:r>
           </w:p>
         </w:tc>
@@ -9914,7 +10069,28 @@
                 <w:szCs w:val="18"/>
                 <w:lang w:val="es-CO"/>
               </w:rPr>
-              <w:t xml:space="preserve">Semana 10</w:t>
+              <w:t xml:space="preserve">Viernes 23 oct.</w:t>
+            </w:r>
+          </w:p>
+          <w:p>
+            <w:pPr>
+              <w:spacing w:before="40" w:after="40"/>
+              <w:jc w:val="center"/>
+              <w:rPr>
+                <w:rFonts w:asciiTheme="minorHAnsi" w:hAnsiTheme="minorHAnsi" w:cstheme="minorHAnsi"/>
+                <w:sz w:val="18"/>
+                <w:szCs w:val="18"/>
+                <w:lang w:val="es-CO"/>
+              </w:rPr>
+            </w:pPr>
+            <w:r>
+              <w:rPr>
+                <w:rFonts w:asciiTheme="minorHAnsi" w:hAnsiTheme="minorHAnsi" w:cstheme="minorHAnsi"/>
+                <w:sz w:val="18"/>
+                <w:szCs w:val="18"/>
+                <w:lang w:val="es-CO"/>
+              </w:rPr>
+              <w:t xml:space="preserve">18:00–21:00</w:t>
             </w:r>
           </w:p>
         </w:tc>
@@ -10184,7 +10360,39 @@
                 <w:szCs w:val="18"/>
                 <w:lang w:val="es-CO"/>
               </w:rPr>
-              <w:t xml:space="preserve">Proyecto: análisis ético y de sostenibilidad; borrador de la model card.</w:t>
+              <w:t xml:space="preserve">Proyecto: análisis ético y de sostenibilidad y model card.</w:t>
+            </w:r>
+          </w:p>
+          <w:p>
+            <w:pPr>
+              <w:spacing w:before="40" w:after="40"/>
+              <w:jc w:val="left"/>
+              <w:rPr>
+                <w:rFonts w:asciiTheme="minorHAnsi" w:hAnsiTheme="minorHAnsi" w:cstheme="minorHAnsi"/>
+                <w:sz w:val="18"/>
+                <w:szCs w:val="18"/>
+                <w:lang w:val="es-CO"/>
+              </w:rPr>
+            </w:pPr>
+            <w:r>
+              <w:rPr>
+                <w:rFonts w:asciiTheme="minorHAnsi" w:hAnsiTheme="minorHAnsi" w:cstheme="minorHAnsi"/>
+                <w:b/>
+                <w:bCs/>
+                <w:sz w:val="18"/>
+                <w:szCs w:val="18"/>
+                <w:lang w:val="es-CO"/>
+              </w:rPr>
+              <w:t xml:space="preserve">Entrega final del proyecto:</w:t>
+            </w:r>
+            <w:r>
+              <w:rPr>
+                <w:rFonts w:asciiTheme="minorHAnsi" w:hAnsiTheme="minorHAnsi" w:cstheme="minorHAnsi"/>
+                <w:sz w:val="18"/>
+                <w:szCs w:val="18"/>
+                <w:lang w:val="es-CO"/>
+              </w:rPr>
+              <w:t xml:space="preserve"> viernes 23 de octubre, 23:59 (repositorio o notebook, informe técnico con la iteración de mejora documentada, model card, demo y registro de uso de IA).</w:t>
             </w:r>
           </w:p>
         </w:tc>
@@ -10327,7 +10535,28 @@
                 <w:szCs w:val="18"/>
                 <w:lang w:val="es-CO"/>
               </w:rPr>
-              <w:t xml:space="preserve">Semana 11</w:t>
+              <w:t xml:space="preserve">Sábado 24 oct.</w:t>
+            </w:r>
+          </w:p>
+          <w:p>
+            <w:pPr>
+              <w:spacing w:before="40" w:after="40"/>
+              <w:jc w:val="center"/>
+              <w:rPr>
+                <w:rFonts w:asciiTheme="minorHAnsi" w:hAnsiTheme="minorHAnsi" w:cstheme="minorHAnsi"/>
+                <w:sz w:val="18"/>
+                <w:szCs w:val="18"/>
+                <w:lang w:val="es-CO"/>
+              </w:rPr>
+            </w:pPr>
+            <w:r>
+              <w:rPr>
+                <w:rFonts w:asciiTheme="minorHAnsi" w:hAnsiTheme="minorHAnsi" w:cstheme="minorHAnsi"/>
+                <w:sz w:val="18"/>
+                <w:szCs w:val="18"/>
+                <w:lang w:val="es-CO"/>
+              </w:rPr>
+              <w:t xml:space="preserve">7:00–10:00</w:t>
             </w:r>
           </w:p>
         </w:tc>
@@ -10576,28 +10805,7 @@
                 <w:szCs w:val="18"/>
                 <w:lang w:val="es-CO"/>
               </w:rPr>
-              <w:t xml:space="preserve">Proyecto (hito formativo): documentar una iteración de mejora.</w:t>
-            </w:r>
-          </w:p>
-          <w:p>
-            <w:pPr>
-              <w:spacing w:before="40" w:after="40"/>
-              <w:jc w:val="left"/>
-              <w:rPr>
-                <w:rFonts w:asciiTheme="minorHAnsi" w:hAnsiTheme="minorHAnsi" w:cstheme="minorHAnsi"/>
-                <w:sz w:val="18"/>
-                <w:szCs w:val="18"/>
-                <w:lang w:val="es-CO"/>
-              </w:rPr>
-            </w:pPr>
-            <w:r>
-              <w:rPr>
-                <w:rFonts w:asciiTheme="minorHAnsi" w:hAnsiTheme="minorHAnsi" w:cstheme="minorHAnsi"/>
-                <w:sz w:val="18"/>
-                <w:szCs w:val="18"/>
-                <w:lang w:val="es-CO"/>
-              </w:rPr>
-              <w:t xml:space="preserve">Preparar informe técnico, model card, demo y ensayo de la socialización.</w:t>
+              <w:t xml:space="preserve">Proyecto: ensayar la socialización de S12 (misma mañana, 10:00).</w:t>
             </w:r>
           </w:p>
         </w:tc>
@@ -10740,7 +10948,28 @@
                 <w:szCs w:val="18"/>
                 <w:lang w:val="es-CO"/>
               </w:rPr>
-              <w:t xml:space="preserve">Semana 12</w:t>
+              <w:t xml:space="preserve">Sábado 24 oct.</w:t>
+            </w:r>
+          </w:p>
+          <w:p>
+            <w:pPr>
+              <w:spacing w:before="40" w:after="40"/>
+              <w:jc w:val="center"/>
+              <w:rPr>
+                <w:rFonts w:asciiTheme="minorHAnsi" w:hAnsiTheme="minorHAnsi" w:cstheme="minorHAnsi"/>
+                <w:sz w:val="18"/>
+                <w:szCs w:val="18"/>
+                <w:lang w:val="es-CO"/>
+              </w:rPr>
+            </w:pPr>
+            <w:r>
+              <w:rPr>
+                <w:rFonts w:asciiTheme="minorHAnsi" w:hAnsiTheme="minorHAnsi" w:cstheme="minorHAnsi"/>
+                <w:sz w:val="18"/>
+                <w:szCs w:val="18"/>
+                <w:lang w:val="es-CO"/>
+              </w:rPr>
+              <w:t xml:space="preserve">10:00–13:00</w:t>
             </w:r>
           </w:p>
         </w:tc>
@@ -10957,7 +11186,7 @@
                 <w:szCs w:val="18"/>
                 <w:lang w:val="es-CO"/>
               </w:rPr>
-              <w:t xml:space="preserve">Antes de la sesión: entrega final (repositorio o notebook, informe técnico, model card, demo y registro de uso de IA).</w:t>
+              <w:t xml:space="preserve">La entrega final se realizó el viernes 23 de octubre (ver S10).</w:t>
             </w:r>
           </w:p>
           <w:p>
@@ -11077,7 +11306,7 @@
           <w:szCs w:val="26"/>
           <w:lang w:val="es-CO"/>
         </w:rPr>
-        <w:t xml:space="preserve">Diálogo formativo (semanas 4 a 6)</w:t>
+        <w:t xml:space="preserve">Diálogo formativo (sesiones 4 a 7)</w:t>
       </w:r>
     </w:p>
     <w:p>
@@ -11098,7 +11327,7 @@
           <w:szCs w:val="24"/>
           <w:lang w:val="es-CO"/>
         </w:rPr>
-        <w:t xml:space="preserve">Entre las semanas 4 y 6 se abre un espacio de diálogo formativo para que cada estudiante conozca su desempeño y ajuste su estrategia antes de la segunda mitad del curso: (a) en S4, cada estudiante revisa el balance de sus challenges S1–S3 (notas, comentarios de la rúbrica y su autoevaluación); (b) cada grupo entrega su propuesta de proyecto entre S5 y S6 y recibe retroalimentación escrita en S6; y (c) los estudiantes o grupos que lo requieran acuerdan una conversación breve con el profesor en el horario de atención.</w:t>
+        <w:t xml:space="preserve">Entre las sesiones 4 y 7 se abre un espacio de diálogo formativo para que cada estudiante conozca su desempeño y ajuste su estrategia antes de la segunda mitad del curso: (a) en S4 (viernes 9 de octubre), cada estudiante revisa el balance de sus challenges S1–S3 (notas, comentarios de la rúbrica y su autoevaluación); (b) cada grupo entrega su propuesta de proyecto hasta el miércoles 14 de octubre y recibe retroalimentación escrita en S7 (viernes 16 de octubre); y (c) los estudiantes o grupos que lo requieran acuerdan una conversación breve con el profesor en el horario de atención.</w:t>
       </w:r>
     </w:p>
     <w:p>
@@ -11188,16 +11417,16 @@
           <w:szCs w:val="24"/>
           <w:lang w:val="es-CO"/>
         </w:rPr>
-        <w:t xml:space="preserve">Prepara tus herramientas desde la primera semana:</w:t>
-      </w:r>
-      <w:r>
-        <w:rPr>
-          <w:rFonts w:asciiTheme="minorHAnsi" w:hAnsiTheme="minorHAnsi" w:cstheme="minorHAnsi"/>
-          <w:sz w:val="24"/>
-          <w:szCs w:val="24"/>
-          <w:lang w:val="es-CO"/>
-        </w:rPr>
-        <w:t xml:space="preserve"> crea tu cuenta de Kaggle y verifica tu número de teléfono (sin verificación no se habilitan la GPU ni el acceso a internet en los notebooks); activa tu licencia de Startti antes de la sesión 6 y guarda tu clave de API en Kaggle Secrets, nunca en el código.</w:t>
+        <w:t xml:space="preserve">Prepara tus herramientas antes de la primera sesión (viernes 2 de octubre):</w:t>
+      </w:r>
+      <w:r>
+        <w:rPr>
+          <w:rFonts w:asciiTheme="minorHAnsi" w:hAnsiTheme="minorHAnsi" w:cstheme="minorHAnsi"/>
+          <w:sz w:val="24"/>
+          <w:szCs w:val="24"/>
+          <w:lang w:val="es-CO"/>
+        </w:rPr>
+        <w:t xml:space="preserve"> crea tu cuenta de Kaggle y verifica tu número de teléfono (sin verificación no se habilitan la GPU ni el acceso a internet en los notebooks); activa tu licencia de Startti antes de la sesión 6 (sábado 10 de octubre) y guarda tu clave de API en Kaggle Secrets, nunca en el código.</w:t>
       </w:r>
     </w:p>
     <w:p>
@@ -11262,16 +11491,16 @@
           <w:szCs w:val="24"/>
           <w:lang w:val="es-CO"/>
         </w:rPr>
-        <w:t xml:space="preserve">Planifica 9 horas semanales de trabajo independiente:</w:t>
-      </w:r>
-      <w:r>
-        <w:rPr>
-          <w:rFonts w:asciiTheme="minorHAnsi" w:hAnsiTheme="minorHAnsi" w:cstheme="minorHAnsi"/>
-          <w:sz w:val="24"/>
-          <w:szCs w:val="24"/>
-          <w:lang w:val="es-CO"/>
-        </w:rPr>
-        <w:t xml:space="preserve"> cerca de 2 h de preparación, 2 h para cerrar el challenge, 2 h de práctica autónoma y 3 h de proyecto. Bloquea esos tiempos en tu agenda.</w:t>
+        <w:t xml:space="preserve">Planifica cerca de 9 horas de trabajo independiente por sesión:</w:t>
+      </w:r>
+      <w:r>
+        <w:rPr>
+          <w:rFonts w:asciiTheme="minorHAnsi" w:hAnsiTheme="minorHAnsi" w:cstheme="minorHAnsi"/>
+          <w:sz w:val="24"/>
+          <w:szCs w:val="24"/>
+          <w:lang w:val="es-CO"/>
+        </w:rPr>
+        <w:t xml:space="preserve"> unas 2 h de preparación, 2 h para cerrar el challenge, 2 h de práctica autónoma y 3 h de proyecto. Como las sesiones se concentran los viernes y sábados, reserva tiempo de lunes a jueves y bloquéalo en tu agenda.</w:t>
       </w:r>
     </w:p>
     <w:p>
@@ -11493,7 +11722,7 @@
           <w:szCs w:val="24"/>
           <w:lang w:val="es-CO"/>
         </w:rPr>
-        <w:t xml:space="preserve"> usa los foros de e-Aulas, el horario de atención y el diálogo formativo de las semanas 4 a 6; si un error técnico te bloquea por más de 20 minutos, pregunta.</w:t>
+        <w:t xml:space="preserve"> usa los foros de e-Aulas, el horario de atención y el diálogo formativo de las sesiones 4 a 7; si un error técnico te bloquea por más de 20 minutos, pregunta.</w:t>
       </w:r>
     </w:p>
     <w:p>

</xml_diff>